<commit_message>
Remove App screenshot from copyright submission materials
</commit_message>
<xml_diff>
--- a/soft_copyright_package/02_睿乐大脑系统V0.7.0产品说明书.docx
+++ b/soft_copyright_package/02_睿乐大脑系统V0.7.0产品说明书.docx
@@ -77,7 +77,7 @@
           <w:b w:val="0"/>
           <w:sz w:val="21"/>
         </w:rPr>
-        <w:t>睿乐大脑系统（简称：睿乐大脑）是一套面向组织知识管理、智能问答和移动端采集场景的软件系统，支持知识库管理、资料整理、智能问答、知识发现、内容发芽和系统配置等能力。</w:t>
+        <w:t>睿乐大脑系统（简称：睿乐大脑）是一套面向组织知识管理、智能问答和资料采集场景的软件系统，支持知识库管理、资料整理、智能问答、知识发现、内容发芽和系统配置等能力。</w:t>
       </w:r>
     </w:p>
     <w:p>
@@ -111,26 +111,6 @@
           <w:sz w:val="20"/>
         </w:rPr>
         <w:t/>
-      </w:r>
-    </w:p>
-    <w:p>
-      <w:pPr>
-        <w:spacing w:after="40"/>
-        <w:ind w:left="259" w:hanging="173"/>
-      </w:pPr>
-      <w:r>
-        <w:rPr>
-          <w:rFonts w:ascii="Heiti SC" w:hAnsi="Heiti SC" w:eastAsia="Heiti SC" w:cs="Heiti SC"/>
-          <w:sz w:val="20"/>
-        </w:rPr>
-        <w:t xml:space="preserve">· </w:t>
-      </w:r>
-      <w:r>
-        <w:rPr>
-          <w:rFonts w:ascii="Heiti SC" w:hAnsi="Heiti SC" w:eastAsia="Heiti SC" w:cs="Heiti SC"/>
-          <w:sz w:val="20"/>
-        </w:rPr>
-        <w:t>App 端依据 mobile 模块源码说明，覆盖 Flutter、Android 与 iOS 工程。</w:t>
       </w:r>
     </w:p>
     <w:p>
@@ -557,26 +537,6 @@
           <w:sz w:val="19"/>
         </w:rPr>
         <w:t>支持关键词搜索、状态查看和资料列表展示。</w:t>
-      </w:r>
-    </w:p>
-    <w:p>
-      <w:pPr>
-        <w:spacing w:after="40"/>
-        <w:ind w:left="259" w:hanging="173"/>
-      </w:pPr>
-      <w:r>
-        <w:rPr>
-          <w:rFonts w:ascii="Heiti SC" w:hAnsi="Heiti SC" w:eastAsia="Heiti SC" w:cs="Heiti SC"/>
-          <w:sz w:val="19"/>
-        </w:rPr>
-        <w:t xml:space="preserve">· </w:t>
-      </w:r>
-      <w:r>
-        <w:rPr>
-          <w:rFonts w:ascii="Heiti SC" w:hAnsi="Heiti SC" w:eastAsia="Heiti SC" w:cs="Heiti SC"/>
-          <w:sz w:val="19"/>
-        </w:rPr>
-        <w:t>App 端上传的音频和记忆可进入该模块进行后续处理。</w:t>
       </w:r>
     </w:p>
     <w:p>
@@ -1195,282 +1155,6 @@
         <w:t>图8 线上经营复盘素材页面</w:t>
       </w:r>
     </w:p>
-    <w:p>
-      <w:pPr>
-        <w:pageBreakBefore/>
-        <w:spacing w:after="100" w:line="269" w:lineRule="auto" w:before="120"/>
-      </w:pPr>
-      <w:r>
-        <w:rPr>
-          <w:rFonts w:ascii="Heiti SC" w:hAnsi="Heiti SC" w:eastAsia="Heiti SC" w:cs="Heiti SC"/>
-          <w:b/>
-          <w:color w:val="315B8F"/>
-          <w:sz w:val="30"/>
-        </w:rPr>
-        <w:t>9. App端能力</w:t>
-      </w:r>
-    </w:p>
-    <w:p>
-      <w:pPr>
-        <w:spacing w:after="60" w:line="269" w:lineRule="auto"/>
-      </w:pPr>
-      <w:r>
-        <w:rPr>
-          <w:rFonts w:ascii="Heiti SC" w:hAnsi="Heiti SC" w:eastAsia="Heiti SC" w:cs="Heiti SC"/>
-          <w:b w:val="0"/>
-          <w:sz w:val="20"/>
-        </w:rPr>
-        <w:t>App 端源码位于 mobile 目录，Flutter 工程版本为 1.0.0+1，包含 Android 与 iOS 工程。App 端围绕移动采集场景，提供登录态保存、录音卡连接、音频处理和记忆上传能力。</w:t>
-      </w:r>
-    </w:p>
-    <w:p>
-      <w:pPr>
-        <w:spacing w:after="40"/>
-        <w:ind w:left="259" w:hanging="173"/>
-      </w:pPr>
-      <w:r>
-        <w:rPr>
-          <w:rFonts w:ascii="Heiti SC" w:hAnsi="Heiti SC" w:eastAsia="Heiti SC" w:cs="Heiti SC"/>
-          <w:sz w:val="19"/>
-        </w:rPr>
-        <w:t xml:space="preserve">· </w:t>
-      </w:r>
-      <w:r>
-        <w:rPr>
-          <w:rFonts w:ascii="Heiti SC" w:hAnsi="Heiti SC" w:eastAsia="Heiti SC" w:cs="Heiti SC"/>
-          <w:sz w:val="19"/>
-        </w:rPr>
-        <w:t>认证与会话：保存访问令牌、刷新令牌、空间和用户信息。</w:t>
-      </w:r>
-    </w:p>
-    <w:p>
-      <w:pPr>
-        <w:spacing w:after="40"/>
-        <w:ind w:left="259" w:hanging="173"/>
-      </w:pPr>
-      <w:r>
-        <w:rPr>
-          <w:rFonts w:ascii="Heiti SC" w:hAnsi="Heiti SC" w:eastAsia="Heiti SC" w:cs="Heiti SC"/>
-          <w:sz w:val="19"/>
-        </w:rPr>
-        <w:t xml:space="preserve">· </w:t>
-      </w:r>
-      <w:r>
-        <w:rPr>
-          <w:rFonts w:ascii="Heiti SC" w:hAnsi="Heiti SC" w:eastAsia="Heiti SC" w:cs="Heiti SC"/>
-          <w:sz w:val="19"/>
-        </w:rPr>
-        <w:t>录音卡连接：扫描并连接蓝牙设备，维护连接状态和设备快照。</w:t>
-      </w:r>
-    </w:p>
-    <w:p>
-      <w:pPr>
-        <w:spacing w:after="40"/>
-        <w:ind w:left="259" w:hanging="173"/>
-      </w:pPr>
-      <w:r>
-        <w:rPr>
-          <w:rFonts w:ascii="Heiti SC" w:hAnsi="Heiti SC" w:eastAsia="Heiti SC" w:cs="Heiti SC"/>
-          <w:sz w:val="19"/>
-        </w:rPr>
-        <w:t xml:space="preserve">· </w:t>
-      </w:r>
-      <w:r>
-        <w:rPr>
-          <w:rFonts w:ascii="Heiti SC" w:hAnsi="Heiti SC" w:eastAsia="Heiti SC" w:cs="Heiti SC"/>
-          <w:sz w:val="19"/>
-        </w:rPr>
-        <w:t>资料采集：支持音频录制、播放、上传以及移动端资料预览。</w:t>
-      </w:r>
-    </w:p>
-    <w:p>
-      <w:pPr>
-        <w:spacing w:after="40"/>
-        <w:ind w:left="259" w:hanging="173"/>
-      </w:pPr>
-      <w:r>
-        <w:rPr>
-          <w:rFonts w:ascii="Heiti SC" w:hAnsi="Heiti SC" w:eastAsia="Heiti SC" w:cs="Heiti SC"/>
-          <w:sz w:val="19"/>
-        </w:rPr>
-        <w:t xml:space="preserve">· </w:t>
-      </w:r>
-      <w:r>
-        <w:rPr>
-          <w:rFonts w:ascii="Heiti SC" w:hAnsi="Heiti SC" w:eastAsia="Heiti SC" w:cs="Heiti SC"/>
-          <w:sz w:val="19"/>
-        </w:rPr>
-        <w:t>服务端同步：通过接口创建记忆、上传音频，并进入后续知识处理流程。</w:t>
-      </w:r>
-    </w:p>
-    <w:p>
-      <w:pPr>
-        <w:spacing w:after="80"/>
-        <w:jc w:val="center"/>
-      </w:pPr>
-      <w:r>
-        <w:drawing>
-          <wp:inline xmlns:a="http://schemas.openxmlformats.org/drawingml/2006/main" xmlns:pic="http://schemas.openxmlformats.org/drawingml/2006/picture">
-            <wp:extent cx="5532120" cy="3829929"/>
-            <wp:docPr id="9" name="Picture 9"/>
-            <wp:cNvGraphicFramePr>
-              <a:graphicFrameLocks noChangeAspect="1"/>
-            </wp:cNvGraphicFramePr>
-            <a:graphic>
-              <a:graphicData uri="http://schemas.openxmlformats.org/drawingml/2006/picture">
-                <pic:pic>
-                  <pic:nvPicPr>
-                    <pic:cNvPr id="0" name="09_App端功能概览.png"/>
-                    <pic:cNvPicPr/>
-                  </pic:nvPicPr>
-                  <pic:blipFill>
-                    <a:blip r:embed="rId17"/>
-                    <a:stretch>
-                      <a:fillRect/>
-                    </a:stretch>
-                  </pic:blipFill>
-                  <pic:spPr>
-                    <a:xfrm>
-                      <a:off x="0" y="0"/>
-                      <a:ext cx="5532120" cy="3829929"/>
-                    </a:xfrm>
-                    <a:prstGeom prst="rect"/>
-                  </pic:spPr>
-                </pic:pic>
-              </a:graphicData>
-            </a:graphic>
-          </wp:inline>
-        </w:drawing>
-      </w:r>
-    </w:p>
-    <w:p>
-      <w:pPr>
-        <w:spacing w:after="60" w:line="269" w:lineRule="auto"/>
-        <w:jc w:val="center"/>
-      </w:pPr>
-      <w:r>
-        <w:rPr>
-          <w:rFonts w:ascii="Heiti SC" w:hAnsi="Heiti SC" w:eastAsia="Heiti SC" w:cs="Heiti SC"/>
-          <w:b w:val="0"/>
-          <w:sz w:val="18"/>
-        </w:rPr>
-        <w:t>图9 App端功能概览</w:t>
-      </w:r>
-    </w:p>
-    <w:p>
-      <w:pPr>
-        <w:pageBreakBefore/>
-        <w:spacing w:after="100" w:line="269" w:lineRule="auto" w:before="120"/>
-      </w:pPr>
-      <w:r>
-        <w:rPr>
-          <w:rFonts w:ascii="Heiti SC" w:hAnsi="Heiti SC" w:eastAsia="Heiti SC" w:cs="Heiti SC"/>
-          <w:b/>
-          <w:color w:val="315B8F"/>
-          <w:sz w:val="30"/>
-        </w:rPr>
-        <w:t>10. 软件特点</w:t>
-      </w:r>
-    </w:p>
-    <w:p>
-      <w:pPr>
-        <w:spacing w:after="40"/>
-        <w:ind w:left="259" w:hanging="173"/>
-      </w:pPr>
-      <w:r>
-        <w:rPr>
-          <w:rFonts w:ascii="Heiti SC" w:hAnsi="Heiti SC" w:eastAsia="Heiti SC" w:cs="Heiti SC"/>
-          <w:sz w:val="20"/>
-        </w:rPr>
-        <w:t xml:space="preserve">· Web 端线上页面已统一采用睿乐大脑品牌，主界面、登录态页面和功能模块均显示睿乐大脑。</w:t>
-      </w:r>
-      <w:r>
-        <w:rPr>
-          <w:rFonts w:ascii="Heiti SC" w:hAnsi="Heiti SC" w:eastAsia="Heiti SC" w:cs="Heiti SC"/>
-          <w:sz w:val="20"/>
-        </w:rPr>
-        <w:t/>
-      </w:r>
-    </w:p>
-    <w:p>
-      <w:pPr>
-        <w:spacing w:after="40"/>
-        <w:ind w:left="259" w:hanging="173"/>
-      </w:pPr>
-      <w:r>
-        <w:rPr>
-          <w:rFonts w:ascii="Heiti SC" w:hAnsi="Heiti SC" w:eastAsia="Heiti SC" w:cs="Heiti SC"/>
-          <w:sz w:val="20"/>
-        </w:rPr>
-        <w:t xml:space="preserve">· </w:t>
-      </w:r>
-      <w:r>
-        <w:rPr>
-          <w:rFonts w:ascii="Heiti SC" w:hAnsi="Heiti SC" w:eastAsia="Heiti SC" w:cs="Heiti SC"/>
-          <w:sz w:val="20"/>
-        </w:rPr>
-        <w:t>系统覆盖知识库、问答、记忆、发现、发芽、配置和移动采集等工作流。</w:t>
-      </w:r>
-    </w:p>
-    <w:p>
-      <w:pPr>
-        <w:spacing w:after="40"/>
-        <w:ind w:left="259" w:hanging="173"/>
-      </w:pPr>
-      <w:r>
-        <w:rPr>
-          <w:rFonts w:ascii="Heiti SC" w:hAnsi="Heiti SC" w:eastAsia="Heiti SC" w:cs="Heiti SC"/>
-          <w:sz w:val="20"/>
-        </w:rPr>
-        <w:t xml:space="preserve">· </w:t>
-      </w:r>
-      <w:r>
-        <w:rPr>
-          <w:rFonts w:ascii="Heiti SC" w:hAnsi="Heiti SC" w:eastAsia="Heiti SC" w:cs="Heiti SC"/>
-          <w:sz w:val="20"/>
-        </w:rPr>
-        <w:t>App 端与 Web 服务端接口衔接，支持将移动场景资料沉淀为知识资产。</w:t>
-      </w:r>
-    </w:p>
-    <w:p>
-      <w:pPr>
-        <w:spacing w:after="40"/>
-        <w:ind w:left="259" w:hanging="173"/>
-      </w:pPr>
-      <w:r>
-        <w:rPr>
-          <w:rFonts w:ascii="Heiti SC" w:hAnsi="Heiti SC" w:eastAsia="Heiti SC" w:cs="Heiti SC"/>
-          <w:sz w:val="20"/>
-        </w:rPr>
-        <w:t>· 正式提交前仍需确认联系人、首次发表日期/地点等线上申请信息。</w:t>
-      </w:r>
-      <w:r>
-        <w:rPr>
-          <w:rFonts w:ascii="Heiti SC" w:hAnsi="Heiti SC" w:eastAsia="Heiti SC" w:cs="Heiti SC"/>
-          <w:sz w:val="20"/>
-        </w:rPr>
-      </w:r>
-    </w:p>
-    <w:p>
-      <w:pPr>
-        <w:spacing w:after="40"/>
-        <w:ind w:left="259" w:hanging="173"/>
-      </w:pPr>
-      <w:r>
-        <w:rPr>
-          <w:rFonts w:ascii="Heiti SC" w:hAnsi="Heiti SC" w:eastAsia="Heiti SC" w:cs="Heiti SC"/>
-          <w:sz w:val="20"/>
-        </w:rPr>
-        <w:t xml:space="preserve">· </w:t>
-      </w:r>
-      <w:r>
-        <w:rPr>
-          <w:rFonts w:ascii="Heiti SC" w:hAnsi="Heiti SC" w:eastAsia="Heiti SC" w:cs="Heiti SC"/>
-          <w:sz w:val="20"/>
-        </w:rPr>
-        <w:t>以上功能说明、申请表预填信息和源码鉴别材料保持同一软件名称、简称和版本号。</w:t>
-      </w:r>
-    </w:p>
     <w:sectPr>
       <w:pgSz w:w="12240" w:h="15840"/>
       <w:pgMar w:top="720" w:right="835" w:bottom="648" w:left="835" w:header="720" w:footer="720" w:gutter="0"/>

</xml_diff>